<commit_message>
Capturas y Documento claring house preference SPA 1
</commit_message>
<xml_diff>
--- a/entrega_pruebas_funcionales_usuarios/paquete_final/Guia_funcional_pruebas_locales_ACH_Interbank_ACH_COLOMBIA_CENIT_MANUAL_OPERATIVO_COMPLETO_FLUJOS_SUBPANTALLAS_V3_REVISADO.docx
+++ b/entrega_pruebas_funcionales_usuarios/paquete_final/Guia_funcional_pruebas_locales_ACH_Interbank_ACH_COLOMBIA_CENIT_MANUAL_OPERATIVO_COMPLETO_FLUJOS_SUBPANTALLAS_V3_REVISADO.docx
@@ -21665,19 +21665,19 @@
         <w:pStyle w:val="Ttulo2"/>
       </w:pPr>
       <w:r>
-        <w:t>Entidad financiera y dígito de verificación</w:t>
-      </w:r>
-    </w:p>
-    <w:p>
-      <w:r>
-        <w:t>Vista de mantenimiento de entidades financieras y campo visible de verificación.</w:t>
+        <w:t>Prioridades por cámara compensadora</w:t>
+      </w:r>
+    </w:p>
+    <w:p>
+      <w:r>
+        <w:t>Listado principal con prioridades operativas visibles por institución y cámara.</w:t>
       </w:r>
     </w:p>
     <w:p>
       <w:r>
         <w:drawing>
           <wp:inline xmlns:a="http://schemas.openxmlformats.org/drawingml/2006/main" xmlns:pic="http://schemas.openxmlformats.org/drawingml/2006/picture">
-            <wp:extent cx="5943600" cy="6686550"/>
+            <wp:extent cx="5943600" cy="4457700"/>
             <wp:docPr id="28" name="Picture 28"/>
             <wp:cNvGraphicFramePr>
               <a:graphicFrameLocks noChangeAspect="1"/>
@@ -21686,7 +21686,7 @@
               <a:graphicData uri="http://schemas.openxmlformats.org/drawingml/2006/picture">
                 <pic:pic>
                   <pic:nvPicPr>
-                    <pic:cNvPr id="0" name="32_financial_institutions_mantenimiento_digito_verificacion.png"/>
+                    <pic:cNvPr id="0" name="33_clearing_house_preferences_prioridades_camara.png"/>
                     <pic:cNvPicPr/>
                   </pic:nvPicPr>
                   <pic:blipFill>
@@ -21698,7 +21698,7 @@
                   <pic:spPr>
                     <a:xfrm>
                       <a:off x="0" y="0"/>
-                      <a:ext cx="5943600" cy="6686550"/>
+                      <a:ext cx="5943600" cy="4457700"/>
                     </a:xfrm>
                     <a:prstGeom prst="rect"/>
                   </pic:spPr>
@@ -21714,19 +21714,19 @@
         <w:pStyle w:val="Ttulo2"/>
       </w:pPr>
       <w:r>
-        <w:t>Priorización por cámara</w:t>
-      </w:r>
-    </w:p>
-    <w:p>
-      <w:r>
-        <w:t>Preferencias operativas para ACH Colombia y CENIT.</w:t>
+        <w:t>Nueva relación</w:t>
+      </w:r>
+    </w:p>
+    <w:p>
+      <w:r>
+        <w:t>Formulario de creación de una nueva relación entre institución y cámara compensadora.</w:t>
       </w:r>
     </w:p>
     <w:p>
       <w:r>
         <w:drawing>
           <wp:inline xmlns:a="http://schemas.openxmlformats.org/drawingml/2006/main" xmlns:pic="http://schemas.openxmlformats.org/drawingml/2006/picture">
-            <wp:extent cx="5943600" cy="6686550"/>
+            <wp:extent cx="5943600" cy="4457700"/>
             <wp:docPr id="29" name="Picture 29"/>
             <wp:cNvGraphicFramePr>
               <a:graphicFrameLocks noChangeAspect="1"/>
@@ -21735,7 +21735,7 @@
               <a:graphicData uri="http://schemas.openxmlformats.org/drawingml/2006/picture">
                 <pic:pic>
                   <pic:nvPicPr>
-                    <pic:cNvPr id="0" name="33_clearing_house_preferences_prioridades_camara.png"/>
+                    <pic:cNvPr id="0" name="33A_clearing_house_preferences_nueva_relacion.png"/>
                     <pic:cNvPicPr/>
                   </pic:nvPicPr>
                   <pic:blipFill>
@@ -21747,7 +21747,7 @@
                   <pic:spPr>
                     <a:xfrm>
                       <a:off x="0" y="0"/>
-                      <a:ext cx="5943600" cy="6686550"/>
+                      <a:ext cx="5943600" cy="4457700"/>
                     </a:xfrm>
                     <a:prstGeom prst="rect"/>
                   </pic:spPr>
@@ -21763,19 +21763,19 @@
         <w:pStyle w:val="Ttulo2"/>
       </w:pPr>
       <w:r>
-        <w:t>Catálogo de tipos de documento</w:t>
-      </w:r>
-    </w:p>
-    <w:p>
-      <w:r>
-        <w:t>Referencia visible de catálogo maestro.</w:t>
+        <w:t>Editar relación</w:t>
+      </w:r>
+    </w:p>
+    <w:p>
+      <w:r>
+        <w:t>Formulario de edición de una relación existente.</w:t>
       </w:r>
     </w:p>
     <w:p>
       <w:r>
         <w:drawing>
           <wp:inline xmlns:a="http://schemas.openxmlformats.org/drawingml/2006/main" xmlns:pic="http://schemas.openxmlformats.org/drawingml/2006/picture">
-            <wp:extent cx="5943600" cy="6686550"/>
+            <wp:extent cx="5943600" cy="4457700"/>
             <wp:docPr id="30" name="Picture 30"/>
             <wp:cNvGraphicFramePr>
               <a:graphicFrameLocks noChangeAspect="1"/>
@@ -21784,7 +21784,7 @@
               <a:graphicData uri="http://schemas.openxmlformats.org/drawingml/2006/picture">
                 <pic:pic>
                   <pic:nvPicPr>
-                    <pic:cNvPr id="0" name="34_catalog_document_types.png"/>
+                    <pic:cNvPr id="0" name="33B_clearing_house_preferences_editar_relacion.png"/>
                     <pic:cNvPicPr/>
                   </pic:nvPicPr>
                   <pic:blipFill>
@@ -21796,7 +21796,7 @@
                   <pic:spPr>
                     <a:xfrm>
                       <a:off x="0" y="0"/>
-                      <a:ext cx="5943600" cy="6686550"/>
+                      <a:ext cx="5943600" cy="4457700"/>
                     </a:xfrm>
                     <a:prstGeom prst="rect"/>
                   </pic:spPr>
@@ -21812,12 +21812,12 @@
         <w:pStyle w:val="Ttulo2"/>
       </w:pPr>
       <w:r>
-        <w:t>Catálogo de género</w:t>
-      </w:r>
-    </w:p>
-    <w:p>
-      <w:r>
-        <w:t>Referencia visible del catálogo maestro.</w:t>
+        <w:t>Entidad financiera y dígito de verificación</w:t>
+      </w:r>
+    </w:p>
+    <w:p>
+      <w:r>
+        <w:t>Vista de mantenimiento de entidades financieras y campo visible de verificación.</w:t>
       </w:r>
     </w:p>
     <w:p>
@@ -21833,7 +21833,7 @@
               <a:graphicData uri="http://schemas.openxmlformats.org/drawingml/2006/picture">
                 <pic:pic>
                   <pic:nvPicPr>
-                    <pic:cNvPr id="0" name="35_catalog_gender_types.png"/>
+                    <pic:cNvPr id="0" name="32_financial_institutions_mantenimiento_digito_verificacion.png"/>
                     <pic:cNvPicPr/>
                   </pic:nvPicPr>
                   <pic:blipFill>
@@ -21861,12 +21861,12 @@
         <w:pStyle w:val="Ttulo2"/>
       </w:pPr>
       <w:r>
-        <w:t>Catálogo de tipos de persona</w:t>
-      </w:r>
-    </w:p>
-    <w:p>
-      <w:r>
-        <w:t>Referencia visible del catálogo maestro.</w:t>
+        <w:t>Catálogo de tipos de documento</w:t>
+      </w:r>
+    </w:p>
+    <w:p>
+      <w:r>
+        <w:t>Referencia visible de catálogo maestro.</w:t>
       </w:r>
     </w:p>
     <w:p>
@@ -21882,7 +21882,7 @@
               <a:graphicData uri="http://schemas.openxmlformats.org/drawingml/2006/picture">
                 <pic:pic>
                   <pic:nvPicPr>
-                    <pic:cNvPr id="0" name="36_catalog_person_types.png"/>
+                    <pic:cNvPr id="0" name="34_catalog_document_types.png"/>
                     <pic:cNvPicPr/>
                   </pic:nvPicPr>
                   <pic:blipFill>
@@ -21910,7 +21910,7 @@
         <w:pStyle w:val="Ttulo2"/>
       </w:pPr>
       <w:r>
-        <w:t>Catálogo de códigos de transacción</w:t>
+        <w:t>Catálogo de género</w:t>
       </w:r>
     </w:p>
     <w:p>
@@ -21931,7 +21931,7 @@
               <a:graphicData uri="http://schemas.openxmlformats.org/drawingml/2006/picture">
                 <pic:pic>
                   <pic:nvPicPr>
-                    <pic:cNvPr id="0" name="37_catalog_transaction_codes.png"/>
+                    <pic:cNvPr id="0" name="35_catalog_gender_types.png"/>
                     <pic:cNvPicPr/>
                   </pic:nvPicPr>
                   <pic:blipFill>
@@ -21959,7 +21959,7 @@
         <w:pStyle w:val="Ttulo2"/>
       </w:pPr>
       <w:r>
-        <w:t>Conceptos de lote</w:t>
+        <w:t>Catálogo de tipos de persona</w:t>
       </w:r>
     </w:p>
     <w:p>
@@ -21980,7 +21980,7 @@
               <a:graphicData uri="http://schemas.openxmlformats.org/drawingml/2006/picture">
                 <pic:pic>
                   <pic:nvPicPr>
-                    <pic:cNvPr id="0" name="38_catalog_company_entry_descriptions.png"/>
+                    <pic:cNvPr id="0" name="36_catalog_person_types.png"/>
                     <pic:cNvPicPr/>
                   </pic:nvPicPr>
                   <pic:blipFill>
@@ -22008,46 +22008,12 @@
         <w:pStyle w:val="Ttulo2"/>
       </w:pPr>
       <w:r>
-        <w:t>Administración de clientes y terceros</w:t>
-      </w:r>
-    </w:p>
-    <w:p>
-      <w:r>
-        <w:t>La validación de terceros y clientes continúa como consulta funcional y registro operativo en el manual.</w:t>
-      </w:r>
-    </w:p>
-    <w:p>
-      <w:r>
-        <w:t>El onboarding silencioso se valida durante la creación de una transacción y no como pantalla independiente.</w:t>
-      </w:r>
-    </w:p>
-    <w:p>
-      <w:pPr>
-        <w:pStyle w:val="Listaconvietas"/>
-      </w:pPr>
-      <w:r>
-        <w:t>Punto 50 queda asociado a /transactions/create.</w:t>
-      </w:r>
-    </w:p>
-    <w:p>
-      <w:pPr>
-        <w:pStyle w:val="Listaconvietas"/>
-      </w:pPr>
-      <w:r>
-        <w:t>Puntos 29 y 55 permanecen como pendientes funcionales, no como cubiertos.</w:t>
-      </w:r>
-    </w:p>
-    <w:p>
-      <w:pPr>
-        <w:pStyle w:val="Ttulo2"/>
-      </w:pPr>
-      <w:r>
-        <w:t>Terceros de prenotificación</w:t>
-      </w:r>
-    </w:p>
-    <w:p>
-      <w:r>
-        <w:t>Listado y búsqueda de terceros de prenotificación.</w:t>
+        <w:t>Catálogo de códigos de transacción</w:t>
+      </w:r>
+    </w:p>
+    <w:p>
+      <w:r>
+        <w:t>Referencia visible del catálogo maestro.</w:t>
       </w:r>
     </w:p>
     <w:p>
@@ -22063,7 +22029,7 @@
               <a:graphicData uri="http://schemas.openxmlformats.org/drawingml/2006/picture">
                 <pic:pic>
                   <pic:nvPicPr>
-                    <pic:cNvPr id="0" name="28_customer_third_parties_listado_busqueda.png"/>
+                    <pic:cNvPr id="0" name="37_catalog_transaction_codes.png"/>
                     <pic:cNvPicPr/>
                   </pic:nvPicPr>
                   <pic:blipFill>
@@ -22091,12 +22057,12 @@
         <w:pStyle w:val="Ttulo2"/>
       </w:pPr>
       <w:r>
-        <w:t>Clientes</w:t>
-      </w:r>
-    </w:p>
-    <w:p>
-      <w:r>
-        <w:t>Listado de clientes disponible en el entorno de pruebas.</w:t>
+        <w:t>Conceptos de lote</w:t>
+      </w:r>
+    </w:p>
+    <w:p>
+      <w:r>
+        <w:t>Referencia visible del catálogo maestro.</w:t>
       </w:r>
     </w:p>
     <w:p>
@@ -22112,7 +22078,7 @@
               <a:graphicData uri="http://schemas.openxmlformats.org/drawingml/2006/picture">
                 <pic:pic>
                   <pic:nvPicPr>
-                    <pic:cNvPr id="0" name="30_customers_listado.png"/>
+                    <pic:cNvPr id="0" name="38_catalog_company_entry_descriptions.png"/>
                     <pic:cNvPicPr/>
                   </pic:nvPicPr>
                   <pic:blipFill>
@@ -22140,12 +22106,46 @@
         <w:pStyle w:val="Ttulo2"/>
       </w:pPr>
       <w:r>
-        <w:t>Alta de clientes</w:t>
-      </w:r>
-    </w:p>
-    <w:p>
-      <w:r>
-        <w:t>Formulario de creación de clientes.</w:t>
+        <w:t>Administración de clientes y terceros</w:t>
+      </w:r>
+    </w:p>
+    <w:p>
+      <w:r>
+        <w:t>La validación de terceros y clientes continúa como consulta funcional y registro operativo en el manual.</w:t>
+      </w:r>
+    </w:p>
+    <w:p>
+      <w:r>
+        <w:t>El onboarding silencioso se valida durante la creación de una transacción y no como pantalla independiente.</w:t>
+      </w:r>
+    </w:p>
+    <w:p>
+      <w:pPr>
+        <w:pStyle w:val="Listaconvietas"/>
+      </w:pPr>
+      <w:r>
+        <w:t>Punto 50 queda asociado a /transactions/create.</w:t>
+      </w:r>
+    </w:p>
+    <w:p>
+      <w:pPr>
+        <w:pStyle w:val="Listaconvietas"/>
+      </w:pPr>
+      <w:r>
+        <w:t>Puntos 29 y 55 permanecen como pendientes funcionales, no como cubiertos.</w:t>
+      </w:r>
+    </w:p>
+    <w:p>
+      <w:pPr>
+        <w:pStyle w:val="Ttulo2"/>
+      </w:pPr>
+      <w:r>
+        <w:t>Terceros de prenotificación</w:t>
+      </w:r>
+    </w:p>
+    <w:p>
+      <w:r>
+        <w:t>Listado y búsqueda de terceros de prenotificación.</w:t>
       </w:r>
     </w:p>
     <w:p>
@@ -22161,7 +22161,7 @@
               <a:graphicData uri="http://schemas.openxmlformats.org/drawingml/2006/picture">
                 <pic:pic>
                   <pic:nvPicPr>
-                    <pic:cNvPr id="0" name="31_customers_nuevo.png"/>
+                    <pic:cNvPr id="0" name="28_customer_third_parties_listado_busqueda.png"/>
                     <pic:cNvPicPr/>
                   </pic:nvPicPr>
                   <pic:blipFill>
@@ -22189,30 +22189,12 @@
         <w:pStyle w:val="Ttulo2"/>
       </w:pPr>
       <w:r>
-        <w:t>Reglas por cámara y ciclos</w:t>
-      </w:r>
-    </w:p>
-    <w:p>
-      <w:r>
-        <w:t>Las reglas por cámara y la configuración de ciclos siguen documentadas como evidencia operativa del manual.</w:t>
-      </w:r>
-    </w:p>
-    <w:p>
-      <w:r>
-        <w:t>No se inventan reglas de CENIT ni fórmulas de dígito de verificación.</w:t>
-      </w:r>
-    </w:p>
-    <w:p>
-      <w:pPr>
-        <w:pStyle w:val="Ttulo2"/>
-      </w:pPr>
-      <w:r>
-        <w:t>Reglas por cámara</w:t>
-      </w:r>
-    </w:p>
-    <w:p>
-      <w:r>
-        <w:t>Reglas visibles para procesamiento operativo.</w:t>
+        <w:t>Clientes</w:t>
+      </w:r>
+    </w:p>
+    <w:p>
+      <w:r>
+        <w:t>Listado de clientes disponible en el entorno de pruebas.</w:t>
       </w:r>
     </w:p>
     <w:p>
@@ -22228,7 +22210,7 @@
               <a:graphicData uri="http://schemas.openxmlformats.org/drawingml/2006/picture">
                 <pic:pic>
                   <pic:nvPicPr>
-                    <pic:cNvPr id="0" name="39_transactions_clearing_house_rules.png"/>
+                    <pic:cNvPr id="0" name="30_customers_listado.png"/>
                     <pic:cNvPicPr/>
                   </pic:nvPicPr>
                   <pic:blipFill>
@@ -22256,12 +22238,12 @@
         <w:pStyle w:val="Ttulo2"/>
       </w:pPr>
       <w:r>
-        <w:t>Configuración de ciclos</w:t>
-      </w:r>
-    </w:p>
-    <w:p>
-      <w:r>
-        <w:t>Ciclos operativos visibles.</w:t>
+        <w:t>Alta de clientes</w:t>
+      </w:r>
+    </w:p>
+    <w:p>
+      <w:r>
+        <w:t>Formulario de creación de clientes.</w:t>
       </w:r>
     </w:p>
     <w:p>
@@ -22277,7 +22259,7 @@
               <a:graphicData uri="http://schemas.openxmlformats.org/drawingml/2006/picture">
                 <pic:pic>
                   <pic:nvPicPr>
-                    <pic:cNvPr id="0" name="40_transactions_cycle_configs.png"/>
+                    <pic:cNvPr id="0" name="31_customers_nuevo.png"/>
                     <pic:cNvPicPr/>
                   </pic:nvPicPr>
                   <pic:blipFill>
@@ -22305,12 +22287,30 @@
         <w:pStyle w:val="Ttulo2"/>
       </w:pPr>
       <w:r>
-        <w:t>Causales de devolución CENIT</w:t>
-      </w:r>
-    </w:p>
-    <w:p>
-      <w:r>
-        <w:t>Causales regulatorias visibles.</w:t>
+        <w:t>Reglas por cámara y ciclos</w:t>
+      </w:r>
+    </w:p>
+    <w:p>
+      <w:r>
+        <w:t>Las reglas por cámara y la configuración de ciclos siguen documentadas como evidencia operativa del manual.</w:t>
+      </w:r>
+    </w:p>
+    <w:p>
+      <w:r>
+        <w:t>No se inventan reglas de CENIT ni fórmulas de dígito de verificación.</w:t>
+      </w:r>
+    </w:p>
+    <w:p>
+      <w:pPr>
+        <w:pStyle w:val="Ttulo2"/>
+      </w:pPr>
+      <w:r>
+        <w:t>Reglas por cámara</w:t>
+      </w:r>
+    </w:p>
+    <w:p>
+      <w:r>
+        <w:t>Reglas visibles para procesamiento operativo.</w:t>
       </w:r>
     </w:p>
     <w:p>
@@ -22326,7 +22326,7 @@
               <a:graphicData uri="http://schemas.openxmlformats.org/drawingml/2006/picture">
                 <pic:pic>
                   <pic:nvPicPr>
-                    <pic:cNvPr id="0" name="41_cenit_causales_devolucion.png"/>
+                    <pic:cNvPr id="0" name="39_transactions_clearing_house_rules.png"/>
                     <pic:cNvPicPr/>
                   </pic:nvPicPr>
                   <pic:blipFill>
@@ -22354,12 +22354,12 @@
         <w:pStyle w:val="Ttulo2"/>
       </w:pPr>
       <w:r>
-        <w:t>Causales de rechazo CENIT</w:t>
-      </w:r>
-    </w:p>
-    <w:p>
-      <w:r>
-        <w:t>Causales regulatorias visibles.</w:t>
+        <w:t>Configuración de ciclos</w:t>
+      </w:r>
+    </w:p>
+    <w:p>
+      <w:r>
+        <w:t>Ciclos operativos visibles.</w:t>
       </w:r>
     </w:p>
     <w:p>
@@ -22375,7 +22375,7 @@
               <a:graphicData uri="http://schemas.openxmlformats.org/drawingml/2006/picture">
                 <pic:pic>
                   <pic:nvPicPr>
-                    <pic:cNvPr id="0" name="42_cenit_causales_rechazo.png"/>
+                    <pic:cNvPr id="0" name="40_transactions_cycle_configs.png"/>
                     <pic:cNvPicPr/>
                   </pic:nvPicPr>
                   <pic:blipFill>
@@ -22403,12 +22403,12 @@
         <w:pStyle w:val="Ttulo2"/>
       </w:pPr>
       <w:r>
-        <w:t>Políticas de transacción CENIT</w:t>
-      </w:r>
-    </w:p>
-    <w:p>
-      <w:r>
-        <w:t>Políticas visibles en pantalla.</w:t>
+        <w:t>Causales de devolución CENIT</w:t>
+      </w:r>
+    </w:p>
+    <w:p>
+      <w:r>
+        <w:t>Causales regulatorias visibles.</w:t>
       </w:r>
     </w:p>
     <w:p>
@@ -22424,7 +22424,7 @@
               <a:graphicData uri="http://schemas.openxmlformats.org/drawingml/2006/picture">
                 <pic:pic>
                   <pic:nvPicPr>
-                    <pic:cNvPr id="0" name="43_cenit_politicas_transaccion.png"/>
+                    <pic:cNvPr id="0" name="41_cenit_causales_devolucion.png"/>
                     <pic:cNvPicPr/>
                   </pic:nvPicPr>
                   <pic:blipFill>
@@ -22452,12 +22452,12 @@
         <w:pStyle w:val="Ttulo2"/>
       </w:pPr>
       <w:r>
-        <w:t>Políticas de prenotificación CENIT</w:t>
-      </w:r>
-    </w:p>
-    <w:p>
-      <w:r>
-        <w:t>Políticas visibles en pantalla.</w:t>
+        <w:t>Causales de rechazo CENIT</w:t>
+      </w:r>
+    </w:p>
+    <w:p>
+      <w:r>
+        <w:t>Causales regulatorias visibles.</w:t>
       </w:r>
     </w:p>
     <w:p>
@@ -22473,7 +22473,7 @@
               <a:graphicData uri="http://schemas.openxmlformats.org/drawingml/2006/picture">
                 <pic:pic>
                   <pic:nvPicPr>
-                    <pic:cNvPr id="0" name="44_cenit_politicas_prenotificacion.png"/>
+                    <pic:cNvPr id="0" name="42_cenit_causales_rechazo.png"/>
                     <pic:cNvPicPr/>
                   </pic:nvPicPr>
                   <pic:blipFill>
@@ -22501,30 +22501,12 @@
         <w:pStyle w:val="Ttulo2"/>
       </w:pPr>
       <w:r>
-        <w:t>Perfiles NACHA-M</w:t>
-      </w:r>
-    </w:p>
-    <w:p>
-      <w:r>
-        <w:t>Los perfiles NACHA-M se mantienen como base de parametrización oficial para la operación.</w:t>
-      </w:r>
-    </w:p>
-    <w:p>
-      <w:r>
-        <w:t>El detalle navegable se documenta solo cuando existe evidencia real visible.</w:t>
-      </w:r>
-    </w:p>
-    <w:p>
-      <w:pPr>
-        <w:pStyle w:val="Ttulo2"/>
-      </w:pPr>
-      <w:r>
-        <w:t>Listado de perfiles NACHA-M</w:t>
-      </w:r>
-    </w:p>
-    <w:p>
-      <w:r>
-        <w:t>Vista principal de perfiles oficiales.</w:t>
+        <w:t>Políticas de transacción CENIT</w:t>
+      </w:r>
+    </w:p>
+    <w:p>
+      <w:r>
+        <w:t>Políticas visibles en pantalla.</w:t>
       </w:r>
     </w:p>
     <w:p>
@@ -22540,7 +22522,7 @@
               <a:graphicData uri="http://schemas.openxmlformats.org/drawingml/2006/picture">
                 <pic:pic>
                   <pic:nvPicPr>
-                    <pic:cNvPr id="0" name="45_nacha_config_perfiles.png"/>
+                    <pic:cNvPr id="0" name="43_cenit_politicas_transaccion.png"/>
                     <pic:cNvPicPr/>
                   </pic:nvPicPr>
                   <pic:blipFill>
@@ -22568,12 +22550,12 @@
         <w:pStyle w:val="Ttulo2"/>
       </w:pPr>
       <w:r>
-        <w:t>Dashboard operativo NACHA-M</w:t>
-      </w:r>
-    </w:p>
-    <w:p>
-      <w:r>
-        <w:t>Consulta operativa read-only.</w:t>
+        <w:t>Políticas de prenotificación CENIT</w:t>
+      </w:r>
+    </w:p>
+    <w:p>
+      <w:r>
+        <w:t>Políticas visibles en pantalla.</w:t>
       </w:r>
     </w:p>
     <w:p>
@@ -22589,7 +22571,7 @@
               <a:graphicData uri="http://schemas.openxmlformats.org/drawingml/2006/picture">
                 <pic:pic>
                   <pic:nvPicPr>
-                    <pic:cNvPr id="0" name="47_nacha_operational_dashboard.png"/>
+                    <pic:cNvPr id="0" name="44_cenit_politicas_prenotificacion.png"/>
                     <pic:cNvPicPr/>
                   </pic:nvPicPr>
                   <pic:blipFill>
@@ -22617,17 +22599,17 @@
         <w:pStyle w:val="Ttulo2"/>
       </w:pPr>
       <w:r>
-        <w:t>Consulta operativa, conciliación y reportes</w:t>
-      </w:r>
-    </w:p>
-    <w:p>
-      <w:r>
-        <w:t>La ampliación conserva el enfoque read-only para consulta operativa, conciliación y reportes.</w:t>
-      </w:r>
-    </w:p>
-    <w:p>
-      <w:r>
-        <w:t>Los casos 56 y 62 permanecen retirados del aplicativo/manual y no se insertan como pantallas activas.</w:t>
+        <w:t>Perfiles NACHA-M</w:t>
+      </w:r>
+    </w:p>
+    <w:p>
+      <w:r>
+        <w:t>Los perfiles NACHA-M se mantienen como base de parametrización oficial para la operación.</w:t>
+      </w:r>
+    </w:p>
+    <w:p>
+      <w:r>
+        <w:t>El detalle navegable se documenta solo cuando existe evidencia real visible.</w:t>
       </w:r>
     </w:p>
     <w:p>
@@ -22635,12 +22617,12 @@
         <w:pStyle w:val="Ttulo2"/>
       </w:pPr>
       <w:r>
-        <w:t>Conciliación ACH</w:t>
-      </w:r>
-    </w:p>
-    <w:p>
-      <w:r>
-        <w:t>Vista de conciliación visible.</w:t>
+        <w:t>Listado de perfiles NACHA-M</w:t>
+      </w:r>
+    </w:p>
+    <w:p>
+      <w:r>
+        <w:t>Vista principal de perfiles oficiales.</w:t>
       </w:r>
     </w:p>
     <w:p>
@@ -22656,7 +22638,7 @@
               <a:graphicData uri="http://schemas.openxmlformats.org/drawingml/2006/picture">
                 <pic:pic>
                   <pic:nvPicPr>
-                    <pic:cNvPr id="0" name="48_ach_reconciliation.png"/>
+                    <pic:cNvPr id="0" name="45_nacha_config_perfiles.png"/>
                     <pic:cNvPicPr/>
                   </pic:nvPicPr>
                   <pic:blipFill>
@@ -22684,12 +22666,12 @@
         <w:pStyle w:val="Ttulo2"/>
       </w:pPr>
       <w:r>
-        <w:t>Reporte de rechazos</w:t>
-      </w:r>
-    </w:p>
-    <w:p>
-      <w:r>
-        <w:t>Vista de reporte de rechazos visible.</w:t>
+        <w:t>Dashboard operativo NACHA-M</w:t>
+      </w:r>
+    </w:p>
+    <w:p>
+      <w:r>
+        <w:t>Consulta operativa read-only.</w:t>
       </w:r>
     </w:p>
     <w:p>
@@ -22705,7 +22687,7 @@
               <a:graphicData uri="http://schemas.openxmlformats.org/drawingml/2006/picture">
                 <pic:pic>
                   <pic:nvPicPr>
-                    <pic:cNvPr id="0" name="49_reports_rejections.png"/>
+                    <pic:cNvPr id="0" name="47_nacha_operational_dashboard.png"/>
                     <pic:cNvPicPr/>
                   </pic:nvPicPr>
                   <pic:blipFill>
@@ -22733,17 +22715,17 @@
         <w:pStyle w:val="Ttulo2"/>
       </w:pPr>
       <w:r>
-        <w:t>Seguridad NACHA-M, certificados y sobre digital</w:t>
-      </w:r>
-    </w:p>
-    <w:p>
-      <w:r>
-        <w:t>Los certificados, sus estados, vigencias y versionado se conservan como pendientes controlados si no hay evidencia suficiente.</w:t>
-      </w:r>
-    </w:p>
-    <w:p>
-      <w:r>
-        <w:t>No se documentan llaves, OpenBao, Bre-B ni rutas de alias.</w:t>
+        <w:t>Consulta operativa, conciliación y reportes</w:t>
+      </w:r>
+    </w:p>
+    <w:p>
+      <w:r>
+        <w:t>La ampliación conserva el enfoque read-only para consulta operativa, conciliación y reportes.</w:t>
+      </w:r>
+    </w:p>
+    <w:p>
+      <w:r>
+        <w:t>Los casos 56 y 62 permanecen retirados del aplicativo/manual y no se insertan como pantallas activas.</w:t>
       </w:r>
     </w:p>
     <w:p>
@@ -22751,12 +22733,12 @@
         <w:pStyle w:val="Ttulo2"/>
       </w:pPr>
       <w:r>
-        <w:t>Dashboard de seguridad NACHA-M</w:t>
-      </w:r>
-    </w:p>
-    <w:p>
-      <w:r>
-        <w:t>Consola base de seguridad visible.</w:t>
+        <w:t>Conciliación ACH</w:t>
+      </w:r>
+    </w:p>
+    <w:p>
+      <w:r>
+        <w:t>Vista de conciliación visible.</w:t>
       </w:r>
     </w:p>
     <w:p>
@@ -22772,7 +22754,7 @@
               <a:graphicData uri="http://schemas.openxmlformats.org/drawingml/2006/picture">
                 <pic:pic>
                   <pic:nvPicPr>
-                    <pic:cNvPr id="0" name="51_nacha_security_dashboard.png"/>
+                    <pic:cNvPr id="0" name="48_ach_reconciliation.png"/>
                     <pic:cNvPicPr/>
                   </pic:nvPicPr>
                   <pic:blipFill>
@@ -22800,12 +22782,12 @@
         <w:pStyle w:val="Ttulo2"/>
       </w:pPr>
       <w:r>
-        <w:t>Gobierno de certificados</w:t>
-      </w:r>
-    </w:p>
-    <w:p>
-      <w:r>
-        <w:t>Vista principal de certificados visible.</w:t>
+        <w:t>Reporte de rechazos</w:t>
+      </w:r>
+    </w:p>
+    <w:p>
+      <w:r>
+        <w:t>Vista de reporte de rechazos visible.</w:t>
       </w:r>
     </w:p>
     <w:p>
@@ -22821,7 +22803,7 @@
               <a:graphicData uri="http://schemas.openxmlformats.org/drawingml/2006/picture">
                 <pic:pic>
                   <pic:nvPicPr>
-                    <pic:cNvPr id="0" name="52_nacha_security_certificates_gobierno.png"/>
+                    <pic:cNvPr id="0" name="49_reports_rejections.png"/>
                     <pic:cNvPicPr/>
                   </pic:nvPicPr>
                   <pic:blipFill>
@@ -22849,12 +22831,30 @@
         <w:pStyle w:val="Ttulo2"/>
       </w:pPr>
       <w:r>
-        <w:t>Cifrado manual con sobre digital</w:t>
-      </w:r>
-    </w:p>
-    <w:p>
-      <w:r>
-        <w:t>Flujo manual visible.</w:t>
+        <w:t>Seguridad NACHA-M, certificados y sobre digital</w:t>
+      </w:r>
+    </w:p>
+    <w:p>
+      <w:r>
+        <w:t>Los certificados, sus estados, vigencias y versionado se conservan como pendientes controlados si no hay evidencia suficiente.</w:t>
+      </w:r>
+    </w:p>
+    <w:p>
+      <w:r>
+        <w:t>No se documentan llaves, OpenBao, Bre-B ni rutas de alias.</w:t>
+      </w:r>
+    </w:p>
+    <w:p>
+      <w:pPr>
+        <w:pStyle w:val="Ttulo2"/>
+      </w:pPr>
+      <w:r>
+        <w:t>Dashboard de seguridad NACHA-M</w:t>
+      </w:r>
+    </w:p>
+    <w:p>
+      <w:r>
+        <w:t>Consola base de seguridad visible.</w:t>
       </w:r>
     </w:p>
     <w:p>
@@ -22870,7 +22870,7 @@
               <a:graphicData uri="http://schemas.openxmlformats.org/drawingml/2006/picture">
                 <pic:pic>
                   <pic:nvPicPr>
-                    <pic:cNvPr id="0" name="59_nacha_manual_encrypt_sobre_digital.png"/>
+                    <pic:cNvPr id="0" name="51_nacha_security_dashboard.png"/>
                     <pic:cNvPicPr/>
                   </pic:nvPicPr>
                   <pic:blipFill>
@@ -22898,12 +22898,12 @@
         <w:pStyle w:val="Ttulo2"/>
       </w:pPr>
       <w:r>
-        <w:t>Descifrado manual con sobre digital</w:t>
-      </w:r>
-    </w:p>
-    <w:p>
-      <w:r>
-        <w:t>Flujo manual visible.</w:t>
+        <w:t>Gobierno de certificados</w:t>
+      </w:r>
+    </w:p>
+    <w:p>
+      <w:r>
+        <w:t>Vista principal de certificados visible.</w:t>
       </w:r>
     </w:p>
     <w:p>
@@ -22919,7 +22919,7 @@
               <a:graphicData uri="http://schemas.openxmlformats.org/drawingml/2006/picture">
                 <pic:pic>
                   <pic:nvPicPr>
-                    <pic:cNvPr id="0" name="60_nacha_manual_decrypt_sobre_digital.png"/>
+                    <pic:cNvPr id="0" name="52_nacha_security_certificates_gobierno.png"/>
                     <pic:cNvPicPr/>
                   </pic:nvPicPr>
                   <pic:blipFill>
@@ -22947,12 +22947,12 @@
         <w:pStyle w:val="Ttulo2"/>
       </w:pPr>
       <w:r>
-        <w:t>Herramienta sobre digital</w:t>
-      </w:r>
-    </w:p>
-    <w:p>
-      <w:r>
-        <w:t>Consola operativa visible.</w:t>
+        <w:t>Cifrado manual con sobre digital</w:t>
+      </w:r>
+    </w:p>
+    <w:p>
+      <w:r>
+        <w:t>Flujo manual visible.</w:t>
       </w:r>
     </w:p>
     <w:p>
@@ -22968,7 +22968,7 @@
               <a:graphicData uri="http://schemas.openxmlformats.org/drawingml/2006/picture">
                 <pic:pic>
                   <pic:nvPicPr>
-                    <pic:cNvPr id="0" name="61_sobre_digital_tool.png"/>
+                    <pic:cNvPr id="0" name="59_nacha_manual_encrypt_sobre_digital.png"/>
                     <pic:cNvPicPr/>
                   </pic:nvPicPr>
                   <pic:blipFill>
@@ -22996,93 +22996,12 @@
         <w:pStyle w:val="Ttulo2"/>
       </w:pPr>
       <w:r>
-        <w:t>Generación NACHA-M, naming y extensiones reglamentarias</w:t>
-      </w:r>
-    </w:p>
-    <w:p>
-      <w:r>
-        <w:t>La generación NACHA-M base corresponde al archivo previo al cifrado o salida final.</w:t>
-      </w:r>
-    </w:p>
-    <w:p>
-      <w:r>
-        <w:t>La generación NACHA-M cifrada corresponde a la salida protegida generada desde el archivo base.</w:t>
-      </w:r>
-    </w:p>
-    <w:p>
-      <w:r>
-        <w:t>El usuario funcional no debe modificar manualmente los archivos generados.</w:t>
-      </w:r>
-    </w:p>
-    <w:p>
-      <w:r>
-        <w:t>Para ACH Colombia, el naming reglamentario del archivo base se maneja como RRRRTTT.ZZZ.1.</w:t>
-      </w:r>
-    </w:p>
-    <w:p>
-      <w:r>
-        <w:t>RRRR corresponde a ruta o identificador de entidad originadora según parametrización.</w:t>
-      </w:r>
-    </w:p>
-    <w:p>
-      <w:r>
-        <w:t>TTT corresponde a tránsito o identificador operativo.</w:t>
-      </w:r>
-    </w:p>
-    <w:p>
-      <w:r>
-        <w:t>ZZZ corresponde al consecutivo diario.</w:t>
-      </w:r>
-    </w:p>
-    <w:p>
-      <w:r>
-        <w:t>.1 corresponde al sufijo o extensión reglamentaria del archivo base.</w:t>
-      </w:r>
-    </w:p>
-    <w:p>
-      <w:r>
-        <w:t>Para CENIT, no se inventa formato; el naming queda sujeto a parametrización o evidencia generada por el aplicativo.</w:t>
-      </w:r>
-    </w:p>
-    <w:p>
-      <w:r>
-        <w:t>La extensión .env solo se documenta como salida final exportable si la aplicación la genera o la muestra.</w:t>
-      </w:r>
-    </w:p>
-    <w:p>
-      <w:r>
-        <w:t>No se asume que el archivo base y el archivo final tengan la misma extensión.</w:t>
-      </w:r>
-    </w:p>
-    <w:p>
-      <w:r>
-        <w:t>No se renombran manualmente archivos para cumplir una regla.</w:t>
-      </w:r>
-    </w:p>
-    <w:p>
-      <w:r>
-        <w:t>Evidencias válidas: archivo generado, nombre visible, registro de exportación, evidencia del ciclo o validación funcional registrada.</w:t>
-      </w:r>
-    </w:p>
-    <w:p>
-      <w:pPr>
-        <w:pStyle w:val="Listaconvietas"/>
-      </w:pPr>
-      <w:r>
-        <w:t>Puntos 57, 58, 64 y 65 permanecen como evidencia funcional, no solo printscreen.</w:t>
-      </w:r>
-    </w:p>
-    <w:p>
-      <w:pPr>
-        <w:pStyle w:val="Ttulo2"/>
-      </w:pPr>
-      <w:r>
-        <w:t>Exportación NACHA-M desde ciclo</w:t>
-      </w:r>
-    </w:p>
-    <w:p>
-      <w:r>
-        <w:t>Salida exportable visible.</w:t>
+        <w:t>Descifrado manual con sobre digital</w:t>
+      </w:r>
+    </w:p>
+    <w:p>
+      <w:r>
+        <w:t>Flujo manual visible.</w:t>
       </w:r>
     </w:p>
     <w:p>
@@ -23098,11 +23017,190 @@
               <a:graphicData uri="http://schemas.openxmlformats.org/drawingml/2006/picture">
                 <pic:pic>
                   <pic:nvPicPr>
+                    <pic:cNvPr id="0" name="60_nacha_manual_decrypt_sobre_digital.png"/>
+                    <pic:cNvPicPr/>
+                  </pic:nvPicPr>
+                  <pic:blipFill>
+                    <a:blip r:embed="rId64"/>
+                    <a:stretch>
+                      <a:fillRect/>
+                    </a:stretch>
+                  </pic:blipFill>
+                  <pic:spPr>
+                    <a:xfrm>
+                      <a:off x="0" y="0"/>
+                      <a:ext cx="5943600" cy="6686550"/>
+                    </a:xfrm>
+                    <a:prstGeom prst="rect"/>
+                  </pic:spPr>
+                </pic:pic>
+              </a:graphicData>
+            </a:graphic>
+          </wp:inline>
+        </w:drawing>
+      </w:r>
+    </w:p>
+    <w:p>
+      <w:pPr>
+        <w:pStyle w:val="Ttulo2"/>
+      </w:pPr>
+      <w:r>
+        <w:t>Herramienta sobre digital</w:t>
+      </w:r>
+    </w:p>
+    <w:p>
+      <w:r>
+        <w:t>Consola operativa visible.</w:t>
+      </w:r>
+    </w:p>
+    <w:p>
+      <w:r>
+        <w:drawing>
+          <wp:inline xmlns:a="http://schemas.openxmlformats.org/drawingml/2006/main" xmlns:pic="http://schemas.openxmlformats.org/drawingml/2006/picture">
+            <wp:extent cx="5943600" cy="6686550"/>
+            <wp:docPr id="54" name="Picture 54"/>
+            <wp:cNvGraphicFramePr>
+              <a:graphicFrameLocks noChangeAspect="1"/>
+            </wp:cNvGraphicFramePr>
+            <a:graphic>
+              <a:graphicData uri="http://schemas.openxmlformats.org/drawingml/2006/picture">
+                <pic:pic>
+                  <pic:nvPicPr>
+                    <pic:cNvPr id="0" name="61_sobre_digital_tool.png"/>
+                    <pic:cNvPicPr/>
+                  </pic:nvPicPr>
+                  <pic:blipFill>
+                    <a:blip r:embed="rId65"/>
+                    <a:stretch>
+                      <a:fillRect/>
+                    </a:stretch>
+                  </pic:blipFill>
+                  <pic:spPr>
+                    <a:xfrm>
+                      <a:off x="0" y="0"/>
+                      <a:ext cx="5943600" cy="6686550"/>
+                    </a:xfrm>
+                    <a:prstGeom prst="rect"/>
+                  </pic:spPr>
+                </pic:pic>
+              </a:graphicData>
+            </a:graphic>
+          </wp:inline>
+        </w:drawing>
+      </w:r>
+    </w:p>
+    <w:p>
+      <w:pPr>
+        <w:pStyle w:val="Ttulo2"/>
+      </w:pPr>
+      <w:r>
+        <w:t>Generación NACHA-M, naming y extensiones reglamentarias</w:t>
+      </w:r>
+    </w:p>
+    <w:p>
+      <w:r>
+        <w:t>La generación NACHA-M base corresponde al archivo previo al cifrado o salida final.</w:t>
+      </w:r>
+    </w:p>
+    <w:p>
+      <w:r>
+        <w:t>La generación NACHA-M cifrada corresponde a la salida protegida generada desde el archivo base.</w:t>
+      </w:r>
+    </w:p>
+    <w:p>
+      <w:r>
+        <w:t>El usuario funcional no debe modificar manualmente los archivos generados.</w:t>
+      </w:r>
+    </w:p>
+    <w:p>
+      <w:r>
+        <w:t>Para ACH Colombia, el naming reglamentario del archivo base se maneja como RRRRTTT.ZZZ.1.</w:t>
+      </w:r>
+    </w:p>
+    <w:p>
+      <w:r>
+        <w:t>RRRR corresponde a ruta o identificador de entidad originadora según parametrización.</w:t>
+      </w:r>
+    </w:p>
+    <w:p>
+      <w:r>
+        <w:t>TTT corresponde a tránsito o identificador operativo.</w:t>
+      </w:r>
+    </w:p>
+    <w:p>
+      <w:r>
+        <w:t>ZZZ corresponde al consecutivo diario.</w:t>
+      </w:r>
+    </w:p>
+    <w:p>
+      <w:r>
+        <w:t>.1 corresponde al sufijo o extensión reglamentaria del archivo base.</w:t>
+      </w:r>
+    </w:p>
+    <w:p>
+      <w:r>
+        <w:t>Para CENIT, no se inventa formato; el naming queda sujeto a parametrización o evidencia generada por el aplicativo.</w:t>
+      </w:r>
+    </w:p>
+    <w:p>
+      <w:r>
+        <w:t>La extensión .env solo se documenta como salida final exportable si la aplicación la genera o la muestra.</w:t>
+      </w:r>
+    </w:p>
+    <w:p>
+      <w:r>
+        <w:t>No se asume que el archivo base y el archivo final tengan la misma extensión.</w:t>
+      </w:r>
+    </w:p>
+    <w:p>
+      <w:r>
+        <w:t>No se renombran manualmente archivos para cumplir una regla.</w:t>
+      </w:r>
+    </w:p>
+    <w:p>
+      <w:r>
+        <w:t>Evidencias válidas: archivo generado, nombre visible, registro de exportación, evidencia del ciclo o validación funcional registrada.</w:t>
+      </w:r>
+    </w:p>
+    <w:p>
+      <w:pPr>
+        <w:pStyle w:val="Listaconvietas"/>
+      </w:pPr>
+      <w:r>
+        <w:t>Puntos 57, 58, 64 y 65 permanecen como evidencia funcional, no solo printscreen.</w:t>
+      </w:r>
+    </w:p>
+    <w:p>
+      <w:pPr>
+        <w:pStyle w:val="Ttulo2"/>
+      </w:pPr>
+      <w:r>
+        <w:t>Exportación NACHA-M desde ciclo</w:t>
+      </w:r>
+    </w:p>
+    <w:p>
+      <w:r>
+        <w:t>Salida exportable visible.</w:t>
+      </w:r>
+    </w:p>
+    <w:p>
+      <w:r>
+        <w:drawing>
+          <wp:inline xmlns:a="http://schemas.openxmlformats.org/drawingml/2006/main" xmlns:pic="http://schemas.openxmlformats.org/drawingml/2006/picture">
+            <wp:extent cx="5943600" cy="6686550"/>
+            <wp:docPr id="55" name="Picture 55"/>
+            <wp:cNvGraphicFramePr>
+              <a:graphicFrameLocks noChangeAspect="1"/>
+            </wp:cNvGraphicFramePr>
+            <a:graphic>
+              <a:graphicData uri="http://schemas.openxmlformats.org/drawingml/2006/picture">
+                <pic:pic>
+                  <pic:nvPicPr>
                     <pic:cNvPr id="0" name="63_ach_cycles_nacha_export.png"/>
                     <pic:cNvPicPr/>
                   </pic:nvPicPr>
                   <pic:blipFill>
-                    <a:blip r:embed="rId64"/>
+                    <a:blip r:embed="rId66"/>
                     <a:stretch>
                       <a:fillRect/>
                     </a:stretch>

</xml_diff>